<commit_message>
Qualys lookup rules: rule 455 Load Balancer Member Match, the one real server behind a virtual server
New rule before the service rule: same VIP sign and service search, then Load Balancer Service to
Pool to Pool Member to server through reference fields and relationships; the real server is
returned only when exactly one sits behind the virtual server, otherwise the service rule keeps
attaching the VIP record. Own Global update set, exported and proven. test_lb_member.py passes
26 of 26 on a fixture model; every other suite, the evidence replay and the client-item sweep
are unchanged. The load balancer document is updated for the new mechanism.

Co-Authored-By: Claude Fable 5.1 <noreply@anthropic.com>
Claude-Session: https://claude.ai/code/session_01UaiSzs85tKmfaeLA1rAxsP
</commit_message>
<xml_diff>
--- a/stories/qualys-ci-lookup-rules/Load Balancer Addresses in CI Matching.docx
+++ b/stories/qualys-ci-lookup-rules/Load Balancer Addresses in CI Matching.docx
@@ -28,7 +28,7 @@
           <w:sz w:val="18"/>
           <w:szCs w:val="18"/>
         </w:rPr>
-        <w:t xml:space="preserve">How a scanned virtual address is resolved today, what is not in place, and what the check with the network team’s examples has to show</w:t>
+        <w:t xml:space="preserve">How a scanned virtual address is resolved, how the real server behind a virtual server is reached, and what the check with the network team’s examples has to show</w:t>
       </w:r>
     </w:p>
     <w:p>
@@ -59,7 +59,7 @@
           <w:sz w:val="18"/>
           <w:szCs w:val="18"/>
         </w:rPr>
-        <w:t xml:space="preserve">Three things are in place for addresses that belong to a load balancer:</w:t>
+        <w:t xml:space="preserve">Four things are in place for addresses that belong to a load balancer:</w:t>
       </w:r>
     </w:p>
     <w:p>
@@ -118,8 +118,12 @@
     </w:p>
     <w:p>
       <w:pPr>
-        <w:shd w:fill="FFF6DC" w:val="clear"/>
-        <w:spacing w:after="70" w:before="0" w:line="250"/>
+        <w:pStyle w:val="ListParagraph"/>
+        <w:numPr>
+          <w:ilvl w:val="0"/>
+          <w:numId w:val="2"/>
+        </w:numPr>
+        <w:spacing w:after="40" w:line="250"/>
       </w:pPr>
       <w:r>
         <w:rPr>
@@ -127,11 +131,12 @@
           <w:sz w:val="18"/>
           <w:szCs w:val="18"/>
         </w:rPr>
-        <w:t xml:space="preserve">One thing is not in place: turning a virtual address into the real addresses of the servers behind it (the “VIP to RIP” mapping). No rule reads the pool and pool member records, and the CMDB extracts looked at so far hold no such records for the virtual servers in question. A finding scanned on a virtual address therefore lands on the Load Balancer Service record when one exists, and stays unmatched otherwise. It is not attributed to the pool members.</w:t>
-      </w:r>
-    </w:p>
-    <w:p>
-      <w:pPr>
+        <w:t xml:space="preserve">A virtual server with exactly one real server behind it in the CMDB is matched to that server. The rule walks the platform’s own load balancer model, Load Balancer Service to Pool to Pool Member to server, and hands the finding to the real server only when it is the single one; with several servers, or without pool data, the virtual server record keeps the finding.</w:t>
+      </w:r>
+    </w:p>
+    <w:p>
+      <w:pPr>
+        <w:shd w:fill="FFF6DC" w:val="clear"/>
         <w:spacing w:after="70" w:before="0" w:line="250"/>
       </w:pPr>
       <w:r>
@@ -140,7 +145,20 @@
           <w:sz w:val="18"/>
           <w:szCs w:val="18"/>
         </w:rPr>
-        <w:t xml:space="preserve">The mechanism described to the client, “DNS Name, then IP Address record, then adapter, then CI”, is mechanism 3 above. It reaches the device whose own adapter carries the address in the chain. A virtual address sits on the load balancer, not on a pool member’s adapter, so that chain cannot land on the real server behind a virtual IP. Whether the network data collection feed puts a virtual-to-real mapping anywhere in the CMDB is exactly what the examples will show; section 6 lists where to look.</w:t>
+        <w:t xml:space="preserve">What this depends on: the pool and pool member records, or the equivalent relationships, must be in the CMDB. The CMDB extracts looked at so far hold no such records for the virtual servers in question, so for those the finding lands on the Load Balancer Service record when one exists and stays unmatched otherwise. Whether the network data collection feed puts the virtual-to-real mapping anywhere in the CMDB is exactly what the examples will show; section 6 describes the model the rule reads and section 7 how to check.</w:t>
+      </w:r>
+    </w:p>
+    <w:p>
+      <w:pPr>
+        <w:spacing w:after="70" w:before="0" w:line="250"/>
+      </w:pPr>
+      <w:r>
+        <w:rPr>
+          <w:rFonts w:ascii="Arial" w:cs="Arial" w:eastAsia="Arial" w:hAnsi="Arial"/>
+          <w:sz w:val="18"/>
+          <w:szCs w:val="18"/>
+        </w:rPr>
+        <w:t xml:space="preserve">The mechanism described to the client, “DNS Name, then IP Address record, then adapter, then CI”, is mechanism 3 above. It reaches the device whose own adapter carries the address in the chain. A virtual address sits on the load balancer, not on a pool member’s adapter, so that chain does not lead to the real server behind a virtual IP; mechanism 4 is the one that does, and it needs the pool records.</w:t>
       </w:r>
     </w:p>
     <w:p>
@@ -2564,7 +2582,7 @@
           <w:sz w:val="24"/>
           <w:szCs w:val="24"/>
         </w:rPr>
-        <w:t xml:space="preserve">6. What a virtual-to-real translation would need</w:t>
+        <w:t xml:space="preserve">6. Mechanism 4: the one real server behind the virtual server</w:t>
       </w:r>
     </w:p>
     <w:p>
@@ -2577,7 +2595,7 @@
           <w:sz w:val="18"/>
           <w:szCs w:val="18"/>
         </w:rPr>
-        <w:t xml:space="preserve">The platform’s own load balancer model already has the shape for it:</w:t>
+        <w:t xml:space="preserve">Rule Load Balancer Member Match runs just before the service rule, for the same hosts (a VIP sign is required) and finds the virtual server the same way. It then walks the platform’s own load balancer model:</w:t>
       </w:r>
     </w:p>
     <w:tbl>
@@ -3033,12 +3051,793 @@
           <w:sz w:val="18"/>
           <w:szCs w:val="18"/>
         </w:rPr>
-        <w:t xml:space="preserve">A rule that walked this model would: find the service for the scanned virtual IP (as today), read its pool, read the pool members, and resolve each member address to one server. That raises the design question that has to be answered before anything is built: a virtual server usually fronts several servers, and the platform attaches one CI to one discovered item. The choices are to keep the finding on the service record (today), to give the finding to the pool members (one finding per member, which the Qualys feed does not produce), or to keep the service record as the CI and use the members for ownership. That is a decision for the client, not a rule setting.</w:t>
-      </w:r>
-    </w:p>
-    <w:p>
-      <w:pPr>
-        <w:spacing w:after="70" w:before="0" w:line="250"/>
+        <w:t xml:space="preserve">Each hop is read both through the reference fields and through relationships, because a bulk load may fill one and not the other: the pool field on the service, pools pointing at the service, pools related to it; members pointing at the pool or related to it; each member address looked up on device records, adapters and IP Address records, and each member followed through its relationships to hardware. Load balancer devices and ignored classes are never counted as real servers. The distinct servers are then counted: exactly one is the match; none, or two or more, and the rule declines so that the service rule attaches the virtual server record.</w:t>
+      </w:r>
+    </w:p>
+    <w:tbl>
+      <w:tblPr>
+        <w:tblW w:type="dxa" w:w="10000"/>
+        <w:tblBorders>
+          <w:top w:val="single" w:color="C8CCD0" w:sz="4"/>
+          <w:left w:val="single" w:color="C8CCD0" w:sz="4"/>
+          <w:bottom w:val="single" w:color="C8CCD0" w:sz="4"/>
+          <w:right w:val="single" w:color="C8CCD0" w:sz="4"/>
+          <w:insideH w:val="single" w:color="C8CCD0" w:sz="4"/>
+          <w:insideV w:val="single" w:color="C8CCD0" w:sz="4"/>
+        </w:tblBorders>
+        <w:tblLayout w:type="fixed"/>
+      </w:tblPr>
+      <w:tblGrid>
+        <w:gridCol w:w="3600"/>
+        <w:gridCol w:w="3700"/>
+        <w:gridCol w:w="2700"/>
+      </w:tblGrid>
+      <w:tr>
+        <w:trPr>
+          <w:cantSplit/>
+        </w:trPr>
+        <w:tc>
+          <w:tcPr>
+            <w:tcW w:type="dxa" w:w="3600"/>
+            <w:shd w:fill="E8EAED" w:val="clear"/>
+            <w:tcMar>
+              <w:top w:type="dxa" w:w="34"/>
+              <w:left w:type="dxa" w:w="80"/>
+              <w:bottom w:type="dxa" w:w="34"/>
+              <w:right w:type="dxa" w:w="80"/>
+            </w:tcMar>
+          </w:tcPr>
+          <w:p>
+            <w:pPr>
+              <w:spacing w:after="0" w:before="0" w:line="225"/>
+            </w:pPr>
+            <w:r>
+              <w:rPr>
+                <w:rFonts w:ascii="Arial" w:cs="Arial" w:eastAsia="Arial" w:hAnsi="Arial"/>
+                <w:b/>
+                <w:bCs/>
+                <w:sz w:val="17"/>
+                <w:szCs w:val="17"/>
+              </w:rPr>
+              <w:t xml:space="preserve">Payload</w:t>
+            </w:r>
+          </w:p>
+        </w:tc>
+        <w:tc>
+          <w:tcPr>
+            <w:tcW w:type="dxa" w:w="3700"/>
+            <w:shd w:fill="E8EAED" w:val="clear"/>
+            <w:tcMar>
+              <w:top w:type="dxa" w:w="34"/>
+              <w:left w:type="dxa" w:w="80"/>
+              <w:bottom w:type="dxa" w:w="34"/>
+              <w:right w:type="dxa" w:w="80"/>
+            </w:tcMar>
+          </w:tcPr>
+          <w:p>
+            <w:pPr>
+              <w:spacing w:after="0" w:before="0" w:line="225"/>
+            </w:pPr>
+            <w:r>
+              <w:rPr>
+                <w:rFonts w:ascii="Arial" w:cs="Arial" w:eastAsia="Arial" w:hAnsi="Arial"/>
+                <w:b/>
+                <w:bCs/>
+                <w:sz w:val="17"/>
+                <w:szCs w:val="17"/>
+              </w:rPr>
+              <w:t xml:space="preserve">What the CMDB holds</w:t>
+            </w:r>
+          </w:p>
+        </w:tc>
+        <w:tc>
+          <w:tcPr>
+            <w:tcW w:type="dxa" w:w="2700"/>
+            <w:shd w:fill="E8EAED" w:val="clear"/>
+            <w:tcMar>
+              <w:top w:type="dxa" w:w="34"/>
+              <w:left w:type="dxa" w:w="80"/>
+              <w:bottom w:type="dxa" w:w="34"/>
+              <w:right w:type="dxa" w:w="80"/>
+            </w:tcMar>
+          </w:tcPr>
+          <w:p>
+            <w:pPr>
+              <w:spacing w:after="0" w:before="0" w:line="225"/>
+            </w:pPr>
+            <w:r>
+              <w:rPr>
+                <w:rFonts w:ascii="Arial" w:cs="Arial" w:eastAsia="Arial" w:hAnsi="Arial"/>
+                <w:b/>
+                <w:bCs/>
+                <w:sz w:val="17"/>
+                <w:szCs w:val="17"/>
+              </w:rPr>
+              <w:t xml:space="preserve">Result</w:t>
+            </w:r>
+          </w:p>
+        </w:tc>
+      </w:tr>
+      <w:tr>
+        <w:trPr>
+          <w:cantSplit/>
+        </w:trPr>
+        <w:tc>
+          <w:tcPr>
+            <w:tcW w:type="dxa" w:w="3600"/>
+            <w:tcMar>
+              <w:top w:type="dxa" w:w="34"/>
+              <w:left w:type="dxa" w:w="80"/>
+              <w:bottom w:type="dxa" w:w="34"/>
+              <w:right w:type="dxa" w:w="80"/>
+            </w:tcMar>
+          </w:tcPr>
+          <w:p>
+            <w:pPr>
+              <w:spacing w:after="0" w:before="0" w:line="225"/>
+            </w:pPr>
+            <w:r>
+              <w:rPr>
+                <w:rFonts w:ascii="Arial" w:cs="Arial" w:eastAsia="Arial" w:hAnsi="Arial"/>
+                <w:b w:val="false"/>
+                <w:bCs w:val="false"/>
+                <w:sz w:val="17"/>
+                <w:szCs w:val="17"/>
+              </w:rPr>
+              <w:t xml:space="preserve">IP 171.203.142.26, OS "F5 Big IP", DNS crisp-tx.bankofamerica.com</w:t>
+            </w:r>
+          </w:p>
+        </w:tc>
+        <w:tc>
+          <w:tcPr>
+            <w:tcW w:type="dxa" w:w="3700"/>
+            <w:tcMar>
+              <w:top w:type="dxa" w:w="34"/>
+              <w:left w:type="dxa" w:w="80"/>
+              <w:bottom w:type="dxa" w:w="34"/>
+              <w:right w:type="dxa" w:w="80"/>
+            </w:tcMar>
+          </w:tcPr>
+          <w:p>
+            <w:pPr>
+              <w:spacing w:after="0" w:before="0" w:line="225"/>
+            </w:pPr>
+            <w:r>
+              <w:rPr>
+                <w:rFonts w:ascii="Arial" w:cs="Arial" w:eastAsia="Arial" w:hAnsi="Arial"/>
+                <w:b w:val="false"/>
+                <w:bCs w:val="false"/>
+                <w:sz w:val="17"/>
+                <w:szCs w:val="17"/>
+              </w:rPr>
+              <w:t xml:space="preserve">service crisp-tx, pool crisp-tx-pool, one member 10.10.20.31, Linux Server usvacrispweb01 on that address</w:t>
+            </w:r>
+          </w:p>
+        </w:tc>
+        <w:tc>
+          <w:tcPr>
+            <w:tcW w:type="dxa" w:w="2700"/>
+            <w:tcMar>
+              <w:top w:type="dxa" w:w="34"/>
+              <w:left w:type="dxa" w:w="80"/>
+              <w:bottom w:type="dxa" w:w="34"/>
+              <w:right w:type="dxa" w:w="80"/>
+            </w:tcMar>
+          </w:tcPr>
+          <w:p>
+            <w:pPr>
+              <w:spacing w:after="0" w:before="0" w:line="225"/>
+            </w:pPr>
+            <w:r>
+              <w:rPr>
+                <w:rFonts w:ascii="Arial" w:cs="Arial" w:eastAsia="Arial" w:hAnsi="Arial"/>
+                <w:b w:val="false"/>
+                <w:bCs w:val="false"/>
+                <w:sz w:val="17"/>
+                <w:szCs w:val="17"/>
+              </w:rPr>
+              <w:t xml:space="preserve">the Linux Server</w:t>
+            </w:r>
+          </w:p>
+        </w:tc>
+      </w:tr>
+      <w:tr>
+        <w:trPr>
+          <w:cantSplit/>
+        </w:trPr>
+        <w:tc>
+          <w:tcPr>
+            <w:tcW w:type="dxa" w:w="3600"/>
+            <w:shd w:fill="F6F7F8" w:val="clear"/>
+            <w:tcMar>
+              <w:top w:type="dxa" w:w="34"/>
+              <w:left w:type="dxa" w:w="80"/>
+              <w:bottom w:type="dxa" w:w="34"/>
+              <w:right w:type="dxa" w:w="80"/>
+            </w:tcMar>
+          </w:tcPr>
+          <w:p>
+            <w:pPr>
+              <w:spacing w:after="0" w:before="0" w:line="225"/>
+            </w:pPr>
+            <w:r>
+              <w:rPr>
+                <w:rFonts w:ascii="Arial" w:cs="Arial" w:eastAsia="Arial" w:hAnsi="Arial"/>
+                <w:b w:val="false"/>
+                <w:bCs w:val="false"/>
+                <w:sz w:val="17"/>
+                <w:szCs w:val="17"/>
+              </w:rPr>
+              <w:t xml:space="preserve">the same virtual server scanned by address only</w:t>
+            </w:r>
+          </w:p>
+        </w:tc>
+        <w:tc>
+          <w:tcPr>
+            <w:tcW w:type="dxa" w:w="3700"/>
+            <w:shd w:fill="F6F7F8" w:val="clear"/>
+            <w:tcMar>
+              <w:top w:type="dxa" w:w="34"/>
+              <w:left w:type="dxa" w:w="80"/>
+              <w:bottom w:type="dxa" w:w="34"/>
+              <w:right w:type="dxa" w:w="80"/>
+            </w:tcMar>
+          </w:tcPr>
+          <w:p>
+            <w:pPr>
+              <w:spacing w:after="0" w:before="0" w:line="225"/>
+            </w:pPr>
+            <w:r>
+              <w:rPr>
+                <w:rFonts w:ascii="Arial" w:cs="Arial" w:eastAsia="Arial" w:hAnsi="Arial"/>
+                <w:b w:val="false"/>
+                <w:bCs w:val="false"/>
+                <w:sz w:val="17"/>
+                <w:szCs w:val="17"/>
+              </w:rPr>
+              <w:t xml:space="preserve">the same records</w:t>
+            </w:r>
+          </w:p>
+        </w:tc>
+        <w:tc>
+          <w:tcPr>
+            <w:tcW w:type="dxa" w:w="2700"/>
+            <w:shd w:fill="F6F7F8" w:val="clear"/>
+            <w:tcMar>
+              <w:top w:type="dxa" w:w="34"/>
+              <w:left w:type="dxa" w:w="80"/>
+              <w:bottom w:type="dxa" w:w="34"/>
+              <w:right w:type="dxa" w:w="80"/>
+            </w:tcMar>
+          </w:tcPr>
+          <w:p>
+            <w:pPr>
+              <w:spacing w:after="0" w:before="0" w:line="225"/>
+            </w:pPr>
+            <w:r>
+              <w:rPr>
+                <w:rFonts w:ascii="Arial" w:cs="Arial" w:eastAsia="Arial" w:hAnsi="Arial"/>
+                <w:b w:val="false"/>
+                <w:bCs w:val="false"/>
+                <w:sz w:val="17"/>
+                <w:szCs w:val="17"/>
+              </w:rPr>
+              <w:t xml:space="preserve">the Linux Server (service found by address)</w:t>
+            </w:r>
+          </w:p>
+        </w:tc>
+      </w:tr>
+      <w:tr>
+        <w:trPr>
+          <w:cantSplit/>
+        </w:trPr>
+        <w:tc>
+          <w:tcPr>
+            <w:tcW w:type="dxa" w:w="3600"/>
+            <w:tcMar>
+              <w:top w:type="dxa" w:w="34"/>
+              <w:left w:type="dxa" w:w="80"/>
+              <w:bottom w:type="dxa" w:w="34"/>
+              <w:right w:type="dxa" w:w="80"/>
+            </w:tcMar>
+          </w:tcPr>
+          <w:p>
+            <w:pPr>
+              <w:spacing w:after="0" w:before="0" w:line="225"/>
+            </w:pPr>
+            <w:r>
+              <w:rPr>
+                <w:rFonts w:ascii="Arial" w:cs="Arial" w:eastAsia="Arial" w:hAnsi="Arial"/>
+                <w:b w:val="false"/>
+                <w:bCs w:val="false"/>
+                <w:sz w:val="17"/>
+                <w:szCs w:val="17"/>
+              </w:rPr>
+              <w:t xml:space="preserve">a virtual server whose pool holds three members on three servers</w:t>
+            </w:r>
+          </w:p>
+        </w:tc>
+        <w:tc>
+          <w:tcPr>
+            <w:tcW w:type="dxa" w:w="3700"/>
+            <w:tcMar>
+              <w:top w:type="dxa" w:w="34"/>
+              <w:left w:type="dxa" w:w="80"/>
+              <w:bottom w:type="dxa" w:w="34"/>
+              <w:right w:type="dxa" w:w="80"/>
+            </w:tcMar>
+          </w:tcPr>
+          <w:p>
+            <w:pPr>
+              <w:spacing w:after="0" w:before="0" w:line="225"/>
+            </w:pPr>
+            <w:r>
+              <w:rPr>
+                <w:rFonts w:ascii="Arial" w:cs="Arial" w:eastAsia="Arial" w:hAnsi="Arial"/>
+                <w:b w:val="false"/>
+                <w:bCs w:val="false"/>
+                <w:sz w:val="17"/>
+                <w:szCs w:val="17"/>
+              </w:rPr>
+              <w:t xml:space="preserve">service, pool, three members, three servers</w:t>
+            </w:r>
+          </w:p>
+        </w:tc>
+        <w:tc>
+          <w:tcPr>
+            <w:tcW w:type="dxa" w:w="2700"/>
+            <w:tcMar>
+              <w:top w:type="dxa" w:w="34"/>
+              <w:left w:type="dxa" w:w="80"/>
+              <w:bottom w:type="dxa" w:w="34"/>
+              <w:right w:type="dxa" w:w="80"/>
+            </w:tcMar>
+          </w:tcPr>
+          <w:p>
+            <w:pPr>
+              <w:spacing w:after="0" w:before="0" w:line="225"/>
+            </w:pPr>
+            <w:r>
+              <w:rPr>
+                <w:rFonts w:ascii="Arial" w:cs="Arial" w:eastAsia="Arial" w:hAnsi="Arial"/>
+                <w:b w:val="false"/>
+                <w:bCs w:val="false"/>
+                <w:sz w:val="17"/>
+                <w:szCs w:val="17"/>
+              </w:rPr>
+              <w:t xml:space="preserve">declined; the service rule attaches the virtual server</w:t>
+            </w:r>
+          </w:p>
+        </w:tc>
+      </w:tr>
+      <w:tr>
+        <w:trPr>
+          <w:cantSplit/>
+        </w:trPr>
+        <w:tc>
+          <w:tcPr>
+            <w:tcW w:type="dxa" w:w="3600"/>
+            <w:shd w:fill="F6F7F8" w:val="clear"/>
+            <w:tcMar>
+              <w:top w:type="dxa" w:w="34"/>
+              <w:left w:type="dxa" w:w="80"/>
+              <w:bottom w:type="dxa" w:w="34"/>
+              <w:right w:type="dxa" w:w="80"/>
+            </w:tcMar>
+          </w:tcPr>
+          <w:p>
+            <w:pPr>
+              <w:spacing w:after="0" w:before="0" w:line="225"/>
+            </w:pPr>
+            <w:r>
+              <w:rPr>
+                <w:rFonts w:ascii="Arial" w:cs="Arial" w:eastAsia="Arial" w:hAnsi="Arial"/>
+                <w:b w:val="false"/>
+                <w:bCs w:val="false"/>
+                <w:sz w:val="17"/>
+                <w:szCs w:val="17"/>
+              </w:rPr>
+              <w:t xml:space="preserve">a virtual server without a pool</w:t>
+            </w:r>
+          </w:p>
+        </w:tc>
+        <w:tc>
+          <w:tcPr>
+            <w:tcW w:type="dxa" w:w="3700"/>
+            <w:shd w:fill="F6F7F8" w:val="clear"/>
+            <w:tcMar>
+              <w:top w:type="dxa" w:w="34"/>
+              <w:left w:type="dxa" w:w="80"/>
+              <w:bottom w:type="dxa" w:w="34"/>
+              <w:right w:type="dxa" w:w="80"/>
+            </w:tcMar>
+          </w:tcPr>
+          <w:p>
+            <w:pPr>
+              <w:spacing w:after="0" w:before="0" w:line="225"/>
+            </w:pPr>
+            <w:r>
+              <w:rPr>
+                <w:rFonts w:ascii="Arial" w:cs="Arial" w:eastAsia="Arial" w:hAnsi="Arial"/>
+                <w:b w:val="false"/>
+                <w:bCs w:val="false"/>
+                <w:sz w:val="17"/>
+                <w:szCs w:val="17"/>
+              </w:rPr>
+              <w:t xml:space="preserve">service only</w:t>
+            </w:r>
+          </w:p>
+        </w:tc>
+        <w:tc>
+          <w:tcPr>
+            <w:tcW w:type="dxa" w:w="2700"/>
+            <w:shd w:fill="F6F7F8" w:val="clear"/>
+            <w:tcMar>
+              <w:top w:type="dxa" w:w="34"/>
+              <w:left w:type="dxa" w:w="80"/>
+              <w:bottom w:type="dxa" w:w="34"/>
+              <w:right w:type="dxa" w:w="80"/>
+            </w:tcMar>
+          </w:tcPr>
+          <w:p>
+            <w:pPr>
+              <w:spacing w:after="0" w:before="0" w:line="225"/>
+            </w:pPr>
+            <w:r>
+              <w:rPr>
+                <w:rFonts w:ascii="Arial" w:cs="Arial" w:eastAsia="Arial" w:hAnsi="Arial"/>
+                <w:b w:val="false"/>
+                <w:bCs w:val="false"/>
+                <w:sz w:val="17"/>
+                <w:szCs w:val="17"/>
+              </w:rPr>
+              <w:t xml:space="preserve">declined; the virtual server record</w:t>
+            </w:r>
+          </w:p>
+        </w:tc>
+      </w:tr>
+      <w:tr>
+        <w:trPr>
+          <w:cantSplit/>
+        </w:trPr>
+        <w:tc>
+          <w:tcPr>
+            <w:tcW w:type="dxa" w:w="3600"/>
+            <w:tcMar>
+              <w:top w:type="dxa" w:w="34"/>
+              <w:left w:type="dxa" w:w="80"/>
+              <w:bottom w:type="dxa" w:w="34"/>
+              <w:right w:type="dxa" w:w="80"/>
+            </w:tcMar>
+          </w:tcPr>
+          <w:p>
+            <w:pPr>
+              <w:spacing w:after="0" w:before="0" w:line="225"/>
+            </w:pPr>
+            <w:r>
+              <w:rPr>
+                <w:rFonts w:ascii="Arial" w:cs="Arial" w:eastAsia="Arial" w:hAnsi="Arial"/>
+                <w:b w:val="false"/>
+                <w:bCs w:val="false"/>
+                <w:sz w:val="17"/>
+                <w:szCs w:val="17"/>
+              </w:rPr>
+              <w:t xml:space="preserve">a member address carried by two device records</w:t>
+            </w:r>
+          </w:p>
+        </w:tc>
+        <w:tc>
+          <w:tcPr>
+            <w:tcW w:type="dxa" w:w="3700"/>
+            <w:tcMar>
+              <w:top w:type="dxa" w:w="34"/>
+              <w:left w:type="dxa" w:w="80"/>
+              <w:bottom w:type="dxa" w:w="34"/>
+              <w:right w:type="dxa" w:w="80"/>
+            </w:tcMar>
+          </w:tcPr>
+          <w:p>
+            <w:pPr>
+              <w:spacing w:after="0" w:before="0" w:line="225"/>
+            </w:pPr>
+            <w:r>
+              <w:rPr>
+                <w:rFonts w:ascii="Arial" w:cs="Arial" w:eastAsia="Arial" w:hAnsi="Arial"/>
+                <w:b w:val="false"/>
+                <w:bCs w:val="false"/>
+                <w:sz w:val="17"/>
+                <w:szCs w:val="17"/>
+              </w:rPr>
+              <w:t xml:space="preserve">two servers on one member address</w:t>
+            </w:r>
+          </w:p>
+        </w:tc>
+        <w:tc>
+          <w:tcPr>
+            <w:tcW w:type="dxa" w:w="2700"/>
+            <w:tcMar>
+              <w:top w:type="dxa" w:w="34"/>
+              <w:left w:type="dxa" w:w="80"/>
+              <w:bottom w:type="dxa" w:w="34"/>
+              <w:right w:type="dxa" w:w="80"/>
+            </w:tcMar>
+          </w:tcPr>
+          <w:p>
+            <w:pPr>
+              <w:spacing w:after="0" w:before="0" w:line="225"/>
+            </w:pPr>
+            <w:r>
+              <w:rPr>
+                <w:rFonts w:ascii="Arial" w:cs="Arial" w:eastAsia="Arial" w:hAnsi="Arial"/>
+                <w:b w:val="false"/>
+                <w:bCs w:val="false"/>
+                <w:sz w:val="17"/>
+                <w:szCs w:val="17"/>
+              </w:rPr>
+              <w:t xml:space="preserve">declined; the virtual server record</w:t>
+            </w:r>
+          </w:p>
+        </w:tc>
+      </w:tr>
+      <w:tr>
+        <w:trPr>
+          <w:cantSplit/>
+        </w:trPr>
+        <w:tc>
+          <w:tcPr>
+            <w:tcW w:type="dxa" w:w="3600"/>
+            <w:shd w:fill="F6F7F8" w:val="clear"/>
+            <w:tcMar>
+              <w:top w:type="dxa" w:w="34"/>
+              <w:left w:type="dxa" w:w="80"/>
+              <w:bottom w:type="dxa" w:w="34"/>
+              <w:right w:type="dxa" w:w="80"/>
+            </w:tcMar>
+          </w:tcPr>
+          <w:p>
+            <w:pPr>
+              <w:spacing w:after="0" w:before="0" w:line="225"/>
+            </w:pPr>
+            <w:r>
+              <w:rPr>
+                <w:rFonts w:ascii="Arial" w:cs="Arial" w:eastAsia="Arial" w:hAnsi="Arial"/>
+                <w:b w:val="false"/>
+                <w:bCs w:val="false"/>
+                <w:sz w:val="17"/>
+                <w:szCs w:val="17"/>
+              </w:rPr>
+              <w:t xml:space="preserve">the only member is the load balancer itself</w:t>
+            </w:r>
+          </w:p>
+        </w:tc>
+        <w:tc>
+          <w:tcPr>
+            <w:tcW w:type="dxa" w:w="3700"/>
+            <w:shd w:fill="F6F7F8" w:val="clear"/>
+            <w:tcMar>
+              <w:top w:type="dxa" w:w="34"/>
+              <w:left w:type="dxa" w:w="80"/>
+              <w:bottom w:type="dxa" w:w="34"/>
+              <w:right w:type="dxa" w:w="80"/>
+            </w:tcMar>
+          </w:tcPr>
+          <w:p>
+            <w:pPr>
+              <w:spacing w:after="0" w:before="0" w:line="225"/>
+            </w:pPr>
+            <w:r>
+              <w:rPr>
+                <w:rFonts w:ascii="Arial" w:cs="Arial" w:eastAsia="Arial" w:hAnsi="Arial"/>
+                <w:b w:val="false"/>
+                <w:bCs w:val="false"/>
+                <w:sz w:val="17"/>
+                <w:szCs w:val="17"/>
+              </w:rPr>
+              <w:t xml:space="preserve">member address on the BIG-IP</w:t>
+            </w:r>
+          </w:p>
+        </w:tc>
+        <w:tc>
+          <w:tcPr>
+            <w:tcW w:type="dxa" w:w="2700"/>
+            <w:shd w:fill="F6F7F8" w:val="clear"/>
+            <w:tcMar>
+              <w:top w:type="dxa" w:w="34"/>
+              <w:left w:type="dxa" w:w="80"/>
+              <w:bottom w:type="dxa" w:w="34"/>
+              <w:right w:type="dxa" w:w="80"/>
+            </w:tcMar>
+          </w:tcPr>
+          <w:p>
+            <w:pPr>
+              <w:spacing w:after="0" w:before="0" w:line="225"/>
+            </w:pPr>
+            <w:r>
+              <w:rPr>
+                <w:rFonts w:ascii="Arial" w:cs="Arial" w:eastAsia="Arial" w:hAnsi="Arial"/>
+                <w:b w:val="false"/>
+                <w:bCs w:val="false"/>
+                <w:sz w:val="17"/>
+                <w:szCs w:val="17"/>
+              </w:rPr>
+              <w:t xml:space="preserve">declined; the virtual server record</w:t>
+            </w:r>
+          </w:p>
+        </w:tc>
+      </w:tr>
+      <w:tr>
+        <w:trPr>
+          <w:cantSplit/>
+        </w:trPr>
+        <w:tc>
+          <w:tcPr>
+            <w:tcW w:type="dxa" w:w="3600"/>
+            <w:tcMar>
+              <w:top w:type="dxa" w:w="34"/>
+              <w:left w:type="dxa" w:w="80"/>
+              <w:bottom w:type="dxa" w:w="34"/>
+              <w:right w:type="dxa" w:w="80"/>
+            </w:tcMar>
+          </w:tcPr>
+          <w:p>
+            <w:pPr>
+              <w:spacing w:after="0" w:before="0" w:line="225"/>
+            </w:pPr>
+            <w:r>
+              <w:rPr>
+                <w:rFonts w:ascii="Arial" w:cs="Arial" w:eastAsia="Arial" w:hAnsi="Arial"/>
+                <w:b w:val="false"/>
+                <w:bCs w:val="false"/>
+                <w:sz w:val="17"/>
+                <w:szCs w:val="17"/>
+              </w:rPr>
+              <w:t xml:space="preserve">pool and member linked by relationships only, no reference fields</w:t>
+            </w:r>
+          </w:p>
+        </w:tc>
+        <w:tc>
+          <w:tcPr>
+            <w:tcW w:type="dxa" w:w="3700"/>
+            <w:tcMar>
+              <w:top w:type="dxa" w:w="34"/>
+              <w:left w:type="dxa" w:w="80"/>
+              <w:bottom w:type="dxa" w:w="34"/>
+              <w:right w:type="dxa" w:w="80"/>
+            </w:tcMar>
+          </w:tcPr>
+          <w:p>
+            <w:pPr>
+              <w:spacing w:after="0" w:before="0" w:line="225"/>
+            </w:pPr>
+            <w:r>
+              <w:rPr>
+                <w:rFonts w:ascii="Arial" w:cs="Arial" w:eastAsia="Arial" w:hAnsi="Arial"/>
+                <w:b w:val="false"/>
+                <w:bCs w:val="false"/>
+                <w:sz w:val="17"/>
+                <w:szCs w:val="17"/>
+              </w:rPr>
+              <w:t xml:space="preserve">relationships Depends on::Used by, member address on an adapter</w:t>
+            </w:r>
+          </w:p>
+        </w:tc>
+        <w:tc>
+          <w:tcPr>
+            <w:tcW w:type="dxa" w:w="2700"/>
+            <w:tcMar>
+              <w:top w:type="dxa" w:w="34"/>
+              <w:left w:type="dxa" w:w="80"/>
+              <w:bottom w:type="dxa" w:w="34"/>
+              <w:right w:type="dxa" w:w="80"/>
+            </w:tcMar>
+          </w:tcPr>
+          <w:p>
+            <w:pPr>
+              <w:spacing w:after="0" w:before="0" w:line="225"/>
+            </w:pPr>
+            <w:r>
+              <w:rPr>
+                <w:rFonts w:ascii="Arial" w:cs="Arial" w:eastAsia="Arial" w:hAnsi="Arial"/>
+                <w:b w:val="false"/>
+                <w:bCs w:val="false"/>
+                <w:sz w:val="17"/>
+                <w:szCs w:val="17"/>
+              </w:rPr>
+              <w:t xml:space="preserve">the server</w:t>
+            </w:r>
+          </w:p>
+        </w:tc>
+      </w:tr>
+      <w:tr>
+        <w:trPr>
+          <w:cantSplit/>
+        </w:trPr>
+        <w:tc>
+          <w:tcPr>
+            <w:tcW w:type="dxa" w:w="3600"/>
+            <w:shd w:fill="F6F7F8" w:val="clear"/>
+            <w:tcMar>
+              <w:top w:type="dxa" w:w="34"/>
+              <w:left w:type="dxa" w:w="80"/>
+              <w:bottom w:type="dxa" w:w="34"/>
+              <w:right w:type="dxa" w:w="80"/>
+            </w:tcMar>
+          </w:tcPr>
+          <w:p>
+            <w:pPr>
+              <w:spacing w:after="0" w:before="0" w:line="225"/>
+            </w:pPr>
+            <w:r>
+              <w:rPr>
+                <w:rFonts w:ascii="Arial" w:cs="Arial" w:eastAsia="Arial" w:hAnsi="Arial"/>
+                <w:b w:val="false"/>
+                <w:bCs w:val="false"/>
+                <w:sz w:val="17"/>
+                <w:szCs w:val="17"/>
+              </w:rPr>
+              <w:t xml:space="preserve">a Red Hat host on the virtual address without a VIP sign</w:t>
+            </w:r>
+          </w:p>
+        </w:tc>
+        <w:tc>
+          <w:tcPr>
+            <w:tcW w:type="dxa" w:w="3700"/>
+            <w:shd w:fill="F6F7F8" w:val="clear"/>
+            <w:tcMar>
+              <w:top w:type="dxa" w:w="34"/>
+              <w:left w:type="dxa" w:w="80"/>
+              <w:bottom w:type="dxa" w:w="34"/>
+              <w:right w:type="dxa" w:w="80"/>
+            </w:tcMar>
+          </w:tcPr>
+          <w:p>
+            <w:pPr>
+              <w:spacing w:after="0" w:before="0" w:line="225"/>
+            </w:pPr>
+            <w:r>
+              <w:rPr>
+                <w:rFonts w:ascii="Arial" w:cs="Arial" w:eastAsia="Arial" w:hAnsi="Arial"/>
+                <w:b w:val="false"/>
+                <w:bCs w:val="false"/>
+                <w:sz w:val="17"/>
+                <w:szCs w:val="17"/>
+              </w:rPr>
+              <w:t xml:space="preserve">not searched</w:t>
+            </w:r>
+          </w:p>
+        </w:tc>
+        <w:tc>
+          <w:tcPr>
+            <w:tcW w:type="dxa" w:w="2700"/>
+            <w:shd w:fill="F6F7F8" w:val="clear"/>
+            <w:tcMar>
+              <w:top w:type="dxa" w:w="34"/>
+              <w:left w:type="dxa" w:w="80"/>
+              <w:bottom w:type="dxa" w:w="34"/>
+              <w:right w:type="dxa" w:w="80"/>
+            </w:tcMar>
+          </w:tcPr>
+          <w:p>
+            <w:pPr>
+              <w:spacing w:after="0" w:before="0" w:line="225"/>
+            </w:pPr>
+            <w:r>
+              <w:rPr>
+                <w:rFonts w:ascii="Arial" w:cs="Arial" w:eastAsia="Arial" w:hAnsi="Arial"/>
+                <w:b w:val="false"/>
+                <w:bCs w:val="false"/>
+                <w:sz w:val="17"/>
+                <w:szCs w:val="17"/>
+              </w:rPr>
+              <w:t xml:space="preserve">rule does not run</w:t>
+            </w:r>
+          </w:p>
+        </w:tc>
+      </w:tr>
+    </w:tbl>
+    <w:p>
+      <w:pPr>
+        <w:spacing w:after="70" w:before="60" w:line="250"/>
       </w:pPr>
       <w:r>
         <w:rPr>
@@ -3046,7 +3845,20 @@
           <w:sz w:val="18"/>
           <w:szCs w:val="18"/>
         </w:rPr>
-        <w:t xml:space="preserve">What the extracts show so far: for the virtual servers pts-zelle-transfer-* and horizon-vip.* the CMDB holds DNS Name records and the placeholder records the import creates for unmatched hosts, and nothing in the three tables above. If the network data collection feed carries a virtual-to-real mapping, it is either loaded elsewhere or not loaded at all; the integration agreement does not mention it.</w:t>
+        <w:t xml:space="preserve">Why exactly one: the platform attaches one CI to one discovered item, and a virtual server that fronts several servers cannot be given to all of them by a lookup rule. One finding per member would need the Qualys feed to produce one item per member, which it does not. Keeping the virtual server record for those cases is the safe choice; if the client prefers another policy for shared pools (for example the pool members as related CIs for ownership), that is a separate piece of work outside the lookup rules.</w:t>
+      </w:r>
+    </w:p>
+    <w:p>
+      <w:pPr>
+        <w:spacing w:after="70" w:before="0" w:line="250"/>
+      </w:pPr>
+      <w:r>
+        <w:rPr>
+          <w:rFonts w:ascii="Arial" w:cs="Arial" w:eastAsia="Arial" w:hAnsi="Arial"/>
+          <w:sz w:val="18"/>
+          <w:szCs w:val="18"/>
+        </w:rPr>
+        <w:t xml:space="preserve">What the extracts show so far: for the virtual servers pts-zelle-transfer-* and horizon-vip.* the CMDB holds DNS Name records and the placeholder records the import creates for unmatched hosts, and nothing in the three tables above. For those the new rule declines and nothing changes. If the network data collection feed carries a virtual-to-real mapping, it is either loaded elsewhere or not loaded at all; the integration agreement does not mention it.</w:t>
       </w:r>
     </w:p>
     <w:p>
@@ -3180,7 +3992,7 @@
           <w:sz w:val="18"/>
           <w:szCs w:val="18"/>
         </w:rPr>
-        <w:t xml:space="preserve">Reading the output: if the service, pool and members are there, the mapping exists and a rule can be written once the attribution choice is made. If only the service exists, the mapping is not in the CMDB. If nothing exists, the virtual server is not modelled at all and matching it to anything would be a guess.</w:t>
+        <w:t xml:space="preserve">Reading the output: if the service, pool and members are there, the mapping exists and mechanism 4 applies as soon as the items are evaluated again. If only the service exists, the mapping is not in the CMDB and the finding stays on the virtual server record. If nothing exists, the virtual server is not modelled at all and matching it to anything would be a guess. When the mapping is kept elsewhere, the probe output shows where the hops break and the rule can be pointed at that place.</w:t>
       </w:r>
     </w:p>
     <w:p>

</xml_diff>